<commit_message>
Update report: clarify the failure cases
Label A4 as a glossary distractor, add the word-overlap check showing no true keyword trap, map E4 and N5 to the failure types in the brief, and use the brief's wording for independent embeddings.
</commit_message>
<xml_diff>
--- a/report/RAG_Report_MaramCharanTeja_2025201010.docx
+++ b/report/RAG_Report_MaramCharanTeja_2025201010.docx
@@ -145,7 +145,7 @@
         <w:pStyle w:val="BodyText"/>
       </w:pPr>
       <w:r>
-        <w:t xml:space="preserve">There are 24 questions: 6 keyword traps, 6 exceptions, 6 negations or constraints and 6 buried details. I fixed the gold chunks before running any retrieval. The primary metric counts a query as a success when a gold chunk is in the Top 3. A stricter secondary rule counts only chunks that answer the question on their own, or complete joint evidence.</w:t>
+        <w:t xml:space="preserve">There are 24 questions in four groups of 6: written as keyword traps, exceptions, negations or constraints, and buried details. I fixed the gold chunks before running any retrieval. The primary metric counts a query as a success when a gold chunk is in the Top 3. A stricter secondary rule counts only chunks that answer the question on their own, or complete joint evidence.</w:t>
       </w:r>
     </w:p>
     <w:tbl>
@@ -345,7 +345,7 @@
         <w:pStyle w:val="FirstParagraph"/>
       </w:pPr>
       <w:r>
-        <w:t xml:space="preserve">A Bi-Encoder encodes the query and each chunk separately into fixed-size vectors. Relevance is the cosine or inner product of two vectors, so the query and the chunk never see each other. A Cross-Encoder concatenates the query and one chunk into a single input and runs self-attention jointly over all their tokens. Every query word can therefore interact with every chunk word in every layer, and the model outputs one relevance score for the pair.</w:t>
+        <w:t xml:space="preserve">A Bi-Encoder produces independent embeddings: it encodes the query and each chunk separately into fixed-size vectors. Relevance is the cosine or inner product of two vectors, so the query and the chunk never see each other. A Cross-Encoder concatenates the query and one chunk into a single input and runs self-attention jointly over all their tokens. Every query word can therefore interact with every chunk word in every layer, and the model outputs one relevance score for the pair.</w:t>
       </w:r>
     </w:p>
     <w:tbl>
@@ -416,7 +416,7 @@
               <w:pStyle w:val="Compact"/>
             </w:pPr>
             <w:r>
-              <w:t xml:space="preserve">Texts encoded separately; they meet only in the final dot product</w:t>
+              <w:t xml:space="preserve">Independent embeddings; the two texts meet only in the final dot product</w:t>
             </w:r>
           </w:p>
         </w:tc>
@@ -648,7 +648,7 @@
               <w:br/>
             </w:r>
             <w:r>
-              <w:t xml:space="preserve">keyword trap</w:t>
+              <w:t xml:space="preserve">glossary distractor (written as a keyword trap)</w:t>
             </w:r>
           </w:p>
         </w:tc>
@@ -1068,7 +1068,15 @@
         <w:t xml:space="preserve">Tailoring</w:t>
       </w:r>
       <w:r>
-        <w:t xml:space="preserve">) held places in the baseline Top 3 and pushed the answer-bearing chunk down. I did not test why the Bi-Encoder ranks such entries so high.</w:t>
+        <w:t xml:space="preserve">) held places in the baseline Top 3 and pushed the answer-bearing chunk down. They are definitions of terms named in the question, so they are plausible distractors, but they are not keyword traps. I counted the question's content words that appear in each chunk, and the answer-bearing chunk shares more of them than any baseline chunk does (A4: 5 of 12 question words in the answer chunk against 0 to 1 in the baseline chunks; E3: 3 of 8 question words in the answer chunk against 2 in the baseline chunks; N5: 4 of 6 question words in the answer chunk against 1 to 2 in the baseline chunks). Across all 24 queries, no non-answer chunk in the baseline Top 3 shares more of the question's words than the best answer chunk does, so by this simple measure I found no true lexical keyword trap. I did not test why the Bi-Encoder ranks short definitions so high.</w:t>
+      </w:r>
+    </w:p>
+    <w:p>
+      <w:pPr>
+        <w:pStyle w:val="BodyText"/>
+      </w:pPr>
+      <w:r>
+        <w:t xml:space="preserve">Against the failure types in the brief: E4 is the clearest exception case, because the baseline already had the general rule (nt-163) but missed the "otherwise" condition in nt-164, which sat at rank 8. N5 fits negation and constraints, because the answer is an exclusion ("other than ... national security systems") and the baseline returned definitions of the term instead. All four cases also fit the last type, a vital chunk buried at ranks 4 to 10 and promoted into the Top 3.</w:t>
       </w:r>
     </w:p>
     <w:bookmarkStart w:id="12" w:name="X3bdd43528d108b16bbbdf019fe629169150f8ed"/>
@@ -1849,7 +1857,7 @@
         </w:numPr>
       </w:pPr>
       <w:r>
-        <w:t xml:space="preserve">Several keyword-trap questions reuse the source's own wording, so they are weaker traps than intended, and the buried-detail questions produced no baseline failure.</w:t>
+        <w:t xml:space="preserve">The questions written as keyword traps reuse the source's own wording, so they did not work as traps, and the buried-detail questions produced no baseline failure.</w:t>
       </w:r>
     </w:p>
     <w:p>

</xml_diff>